<commit_message>
Start initial CPI adjuster
Standardize dataset file names and update code to match. Add test output for adjustment.
</commit_message>
<xml_diff>
--- a/PySupport/AdjustedNasdaq/docs/solution_elements.docx
+++ b/PySupport/AdjustedNasdaq/docs/solution_elements.docx
@@ -11,6 +11,15 @@
         <w:t>Solution Elements</w:t>
       </w:r>
     </w:p>
+    <w:p/>
+    <w:p/>
+    <w:p/>
+    <w:p/>
+    <w:p/>
+    <w:p/>
+    <w:p/>
+    <w:p/>
+    <w:p/>
     <w:tbl>
       <w:tblPr>
         <w:tblStyle w:val="TableGrid"/>
@@ -23,7 +32,7 @@
         <w:gridCol w:w="2285"/>
         <w:gridCol w:w="3872"/>
         <w:gridCol w:w="2721"/>
-        <w:gridCol w:w="2721"/>
+        <w:gridCol w:w="2371"/>
       </w:tblGrid>
       <w:tr>
         <w:trPr>
@@ -232,12 +241,16 @@
           <w:p>
             <w:pPr>
               <w:rPr>
-                <w:sz w:val="20"/>
-                <w:szCs w:val="20"/>
-              </w:rPr>
-            </w:pPr>
-            <w:r>
-              <w:rPr>
+                <w:b/>
+                <w:bCs/>
+                <w:sz w:val="20"/>
+                <w:szCs w:val="20"/>
+              </w:rPr>
+            </w:pPr>
+            <w:r>
+              <w:rPr>
+                <w:b/>
+                <w:bCs/>
                 <w:sz w:val="20"/>
                 <w:szCs w:val="20"/>
               </w:rPr>
@@ -386,7 +399,17 @@
                 <w:sz w:val="22"/>
                 <w:szCs w:val="22"/>
               </w:rPr>
-              <w:t>CPI Cleaning</w:t>
+              <w:t xml:space="preserve">CPI </w:t>
+            </w:r>
+            <w:r>
+              <w:rPr>
+                <w:rFonts w:ascii="Times New Roman" w:hAnsi="Times New Roman" w:cs="Times New Roman"/>
+                <w:b/>
+                <w:bCs/>
+                <w:sz w:val="22"/>
+                <w:szCs w:val="22"/>
+              </w:rPr>
+              <w:t>Augmentation</w:t>
             </w:r>
           </w:p>
         </w:tc>
@@ -570,6 +593,13 @@
                 <w:szCs w:val="20"/>
               </w:rPr>
             </w:pPr>
+            <w:r>
+              <w:rPr>
+                <w:sz w:val="20"/>
+                <w:szCs w:val="20"/>
+              </w:rPr>
+              <w:t>CLI_Test_forecast_log.txt</w:t>
+            </w:r>
           </w:p>
         </w:tc>
         <w:tc>
@@ -707,7 +737,21 @@
                 <w:sz w:val="20"/>
                 <w:szCs w:val="20"/>
               </w:rPr>
-              <w:t>nasdaq_chained_projected.csv</w:t>
+              <w:t>chained_</w:t>
+            </w:r>
+            <w:r>
+              <w:rPr>
+                <w:sz w:val="20"/>
+                <w:szCs w:val="20"/>
+              </w:rPr>
+              <w:t>cpi_</w:t>
+            </w:r>
+            <w:r>
+              <w:rPr>
+                <w:sz w:val="20"/>
+                <w:szCs w:val="20"/>
+              </w:rPr>
+              <w:t>projected.csv</w:t>
             </w:r>
           </w:p>
         </w:tc>
@@ -965,7 +1009,7 @@
                 <w:sz w:val="20"/>
                 <w:szCs w:val="20"/>
               </w:rPr>
-              <w:t>nasdaq_daily_cpi.csv</w:t>
+              <w:t>daily_cpi.csv</w:t>
             </w:r>
           </w:p>
         </w:tc>
@@ -1741,6 +1785,7 @@
   <w:style w:type="character" w:default="1" w:styleId="DefaultParagraphFont">
     <w:name w:val="Default Paragraph Font"/>
     <w:uiPriority w:val="1"/>
+    <w:semiHidden/>
     <w:unhideWhenUsed/>
   </w:style>
   <w:style w:type="table" w:default="1" w:styleId="TableNormal">

</xml_diff>